<commit_message>
Add L3 tree for ALU
</commit_message>
<xml_diff>
--- a/CPU Design/AluFlagBlockDesign.docx
+++ b/CPU Design/AluFlagBlockDesign.docx
@@ -42,41 +42,409 @@
         <w:t>By Pongsapat Boonpong</w:t>
       </w:r>
     </w:p>
-    <w:p>
-      <w:pPr>
-        <w:jc w:val="center"/>
-        <w:rPr>
-          <w:b/>
-          <w:bCs/>
-          <w:sz w:val="32"/>
-          <w:szCs w:val="40"/>
-        </w:rPr>
-      </w:pPr>
-    </w:p>
-    <w:p>
-      <w:pPr>
-        <w:rPr>
-          <w:b/>
-          <w:bCs/>
-          <w:sz w:val="36"/>
-          <w:szCs w:val="44"/>
-        </w:rPr>
-      </w:pPr>
-      <w:r>
-        <w:rPr>
-          <w:b/>
-          <w:bCs/>
-          <w:sz w:val="36"/>
-          <w:szCs w:val="44"/>
-        </w:rPr>
+    <w:tbl>
+      <w:tblPr>
+        <w:tblStyle w:val="TableGrid"/>
+        <w:tblW w:w="0" w:type="auto"/>
+        <w:tblLook w:val="04A0"/>
+      </w:tblPr>
+      <w:tblGrid>
+        <w:gridCol w:w="4134"/>
+        <w:gridCol w:w="4134"/>
+      </w:tblGrid>
+      <w:tr>
+        <w:trPr>
+          <w:trHeight w:val="239"/>
+        </w:trPr>
+        <w:tc>
+          <w:tcPr>
+            <w:tcW w:w="4134" w:type="dxa"/>
+          </w:tcPr>
+          <w:p>
+            <w:pPr>
+              <w:jc w:val="center"/>
+              <w:rPr>
+                <w:b/>
+                <w:bCs/>
+                <w:sz w:val="32"/>
+                <w:szCs w:val="40"/>
+              </w:rPr>
+            </w:pPr>
+            <w:r>
+              <w:rPr>
+                <w:b/>
+                <w:bCs/>
+                <w:sz w:val="32"/>
+                <w:szCs w:val="40"/>
+              </w:rPr>
+              <w:t>Date</w:t>
+            </w:r>
+          </w:p>
+        </w:tc>
+        <w:tc>
+          <w:tcPr>
+            <w:tcW w:w="4134" w:type="dxa"/>
+          </w:tcPr>
+          <w:p>
+            <w:pPr>
+              <w:tabs>
+                <w:tab w:val="center" w:pos="2286"/>
+              </w:tabs>
+              <w:rPr>
+                <w:b/>
+                <w:bCs/>
+                <w:sz w:val="32"/>
+                <w:szCs w:val="40"/>
+              </w:rPr>
+            </w:pPr>
+            <w:r>
+              <w:rPr>
+                <w:b/>
+                <w:bCs/>
+                <w:sz w:val="32"/>
+                <w:szCs w:val="40"/>
+              </w:rPr>
+              <w:tab/>
+              <w:t>Change</w:t>
+            </w:r>
+          </w:p>
+        </w:tc>
+      </w:tr>
+      <w:tr>
+        <w:trPr>
+          <w:trHeight w:val="246"/>
+        </w:trPr>
+        <w:tc>
+          <w:tcPr>
+            <w:tcW w:w="4134" w:type="dxa"/>
+          </w:tcPr>
+          <w:p>
+            <w:pPr>
+              <w:jc w:val="center"/>
+              <w:rPr>
+                <w:b/>
+                <w:bCs/>
+                <w:sz w:val="32"/>
+                <w:szCs w:val="40"/>
+              </w:rPr>
+            </w:pPr>
+            <w:r>
+              <w:rPr>
+                <w:b/>
+                <w:bCs/>
+                <w:sz w:val="32"/>
+                <w:szCs w:val="40"/>
+              </w:rPr>
+              <w:t>29 June 2026</w:t>
+            </w:r>
+          </w:p>
+        </w:tc>
+        <w:tc>
+          <w:tcPr>
+            <w:tcW w:w="4134" w:type="dxa"/>
+          </w:tcPr>
+          <w:p>
+            <w:pPr>
+              <w:tabs>
+                <w:tab w:val="center" w:pos="2286"/>
+              </w:tabs>
+              <w:rPr>
+                <w:b/>
+                <w:bCs/>
+                <w:sz w:val="32"/>
+                <w:szCs w:val="40"/>
+              </w:rPr>
+            </w:pPr>
+            <w:r>
+              <w:rPr>
+                <w:b/>
+                <w:bCs/>
+                <w:sz w:val="32"/>
+                <w:szCs w:val="40"/>
+              </w:rPr>
+              <w:t>Created the document</w:t>
+            </w:r>
+          </w:p>
+        </w:tc>
+      </w:tr>
+      <w:tr>
+        <w:trPr>
+          <w:trHeight w:val="493"/>
+        </w:trPr>
+        <w:tc>
+          <w:tcPr>
+            <w:tcW w:w="4134" w:type="dxa"/>
+          </w:tcPr>
+          <w:p>
+            <w:pPr>
+              <w:jc w:val="center"/>
+              <w:rPr>
+                <w:b/>
+                <w:bCs/>
+                <w:sz w:val="32"/>
+                <w:szCs w:val="40"/>
+              </w:rPr>
+            </w:pPr>
+            <w:r>
+              <w:rPr>
+                <w:b/>
+                <w:bCs/>
+                <w:sz w:val="32"/>
+                <w:szCs w:val="40"/>
+              </w:rPr>
+              <w:t>30 June 2026</w:t>
+            </w:r>
+          </w:p>
+        </w:tc>
+        <w:tc>
+          <w:tcPr>
+            <w:tcW w:w="4134" w:type="dxa"/>
+          </w:tcPr>
+          <w:p>
+            <w:pPr>
+              <w:tabs>
+                <w:tab w:val="center" w:pos="2286"/>
+              </w:tabs>
+              <w:rPr>
+                <w:b/>
+                <w:bCs/>
+                <w:sz w:val="32"/>
+                <w:szCs w:val="40"/>
+              </w:rPr>
+            </w:pPr>
+            <w:r>
+              <w:rPr>
+                <w:b/>
+                <w:bCs/>
+                <w:sz w:val="32"/>
+                <w:szCs w:val="40"/>
+              </w:rPr>
+              <w:t>Add the basic description for flag blocks</w:t>
+            </w:r>
+          </w:p>
+        </w:tc>
+      </w:tr>
+    </w:tbl>
+    <w:p>
+      <w:pPr>
+        <w:jc w:val="center"/>
+        <w:rPr>
+          <w:b/>
+          <w:bCs/>
+          <w:sz w:val="32"/>
+          <w:szCs w:val="40"/>
+        </w:rPr>
+      </w:pPr>
+      <w:r>
+        <w:rPr>
+          <w:b/>
+          <w:bCs/>
+          <w:sz w:val="32"/>
+          <w:szCs w:val="40"/>
+        </w:rPr>
+        <w:tab/>
+      </w:r>
+    </w:p>
+    <w:p>
+      <w:pPr>
+        <w:jc w:val="center"/>
+        <w:rPr>
+          <w:b/>
+          <w:bCs/>
+          <w:sz w:val="32"/>
+          <w:szCs w:val="40"/>
+        </w:rPr>
+      </w:pPr>
+    </w:p>
+    <w:p>
+      <w:pPr>
+        <w:jc w:val="center"/>
+        <w:rPr>
+          <w:b/>
+          <w:bCs/>
+          <w:sz w:val="32"/>
+          <w:szCs w:val="40"/>
+        </w:rPr>
+      </w:pPr>
+    </w:p>
+    <w:p>
+      <w:pPr>
+        <w:jc w:val="center"/>
+        <w:rPr>
+          <w:b/>
+          <w:bCs/>
+          <w:sz w:val="32"/>
+          <w:szCs w:val="40"/>
+        </w:rPr>
+      </w:pPr>
+    </w:p>
+    <w:p>
+      <w:pPr>
+        <w:jc w:val="center"/>
+        <w:rPr>
+          <w:b/>
+          <w:bCs/>
+          <w:sz w:val="32"/>
+          <w:szCs w:val="40"/>
+        </w:rPr>
+      </w:pPr>
+    </w:p>
+    <w:p>
+      <w:pPr>
+        <w:jc w:val="center"/>
+        <w:rPr>
+          <w:b/>
+          <w:bCs/>
+          <w:sz w:val="32"/>
+          <w:szCs w:val="40"/>
+        </w:rPr>
+      </w:pPr>
+    </w:p>
+    <w:p>
+      <w:pPr>
+        <w:jc w:val="center"/>
+        <w:rPr>
+          <w:b/>
+          <w:bCs/>
+          <w:sz w:val="32"/>
+          <w:szCs w:val="40"/>
+        </w:rPr>
+      </w:pPr>
+    </w:p>
+    <w:p>
+      <w:pPr>
+        <w:jc w:val="center"/>
+        <w:rPr>
+          <w:b/>
+          <w:bCs/>
+          <w:sz w:val="32"/>
+          <w:szCs w:val="40"/>
+        </w:rPr>
+      </w:pPr>
+    </w:p>
+    <w:p>
+      <w:pPr>
+        <w:jc w:val="center"/>
+        <w:rPr>
+          <w:b/>
+          <w:bCs/>
+          <w:sz w:val="32"/>
+          <w:szCs w:val="40"/>
+        </w:rPr>
+      </w:pPr>
+    </w:p>
+    <w:p>
+      <w:pPr>
+        <w:jc w:val="center"/>
+        <w:rPr>
+          <w:b/>
+          <w:bCs/>
+          <w:sz w:val="32"/>
+          <w:szCs w:val="40"/>
+        </w:rPr>
+      </w:pPr>
+    </w:p>
+    <w:p>
+      <w:pPr>
+        <w:jc w:val="center"/>
+        <w:rPr>
+          <w:b/>
+          <w:bCs/>
+          <w:sz w:val="32"/>
+          <w:szCs w:val="40"/>
+        </w:rPr>
+      </w:pPr>
+    </w:p>
+    <w:p>
+      <w:pPr>
+        <w:jc w:val="center"/>
+        <w:rPr>
+          <w:b/>
+          <w:bCs/>
+          <w:sz w:val="32"/>
+          <w:szCs w:val="40"/>
+        </w:rPr>
+      </w:pPr>
+    </w:p>
+    <w:p>
+      <w:pPr>
+        <w:jc w:val="center"/>
+        <w:rPr>
+          <w:b/>
+          <w:bCs/>
+          <w:sz w:val="32"/>
+          <w:szCs w:val="40"/>
+        </w:rPr>
+      </w:pPr>
+    </w:p>
+    <w:p>
+      <w:pPr>
+        <w:jc w:val="center"/>
+        <w:rPr>
+          <w:b/>
+          <w:bCs/>
+          <w:sz w:val="32"/>
+          <w:szCs w:val="40"/>
+        </w:rPr>
+      </w:pPr>
+    </w:p>
+    <w:p>
+      <w:pPr>
+        <w:jc w:val="center"/>
+        <w:rPr>
+          <w:b/>
+          <w:bCs/>
+          <w:sz w:val="32"/>
+          <w:szCs w:val="40"/>
+        </w:rPr>
+      </w:pPr>
+    </w:p>
+    <w:p>
+      <w:pPr>
+        <w:jc w:val="center"/>
+        <w:rPr>
+          <w:b/>
+          <w:bCs/>
+          <w:sz w:val="32"/>
+          <w:szCs w:val="40"/>
+        </w:rPr>
+      </w:pPr>
+    </w:p>
+    <w:p>
+      <w:pPr>
+        <w:jc w:val="center"/>
+        <w:rPr>
+          <w:b/>
+          <w:bCs/>
+          <w:sz w:val="32"/>
+          <w:szCs w:val="40"/>
+        </w:rPr>
+      </w:pPr>
+    </w:p>
+    <w:p>
+      <w:pPr>
+        <w:rPr>
+          <w:b/>
+          <w:bCs/>
+          <w:sz w:val="26"/>
+          <w:szCs w:val="26"/>
+        </w:rPr>
+      </w:pPr>
+      <w:r>
+        <w:rPr>
+          <w:b/>
+          <w:bCs/>
+          <w:sz w:val="26"/>
+          <w:szCs w:val="26"/>
+        </w:rPr>
+        <w:lastRenderedPageBreak/>
         <w:t>Purpose</w:t>
       </w:r>
     </w:p>
     <w:p>
       <w:pPr>
         <w:rPr>
-          <w:sz w:val="32"/>
-          <w:szCs w:val="40"/>
+          <w:szCs w:val="22"/>
         </w:rPr>
       </w:pPr>
       <w:r>
@@ -85,68 +453,857 @@
           <w:szCs w:val="40"/>
         </w:rPr>
         <w:tab/>
-        <w:t>The purpose of the document is to explain the function of each sub-block (called “L2”) to understand how it’ll work.</w:t>
-      </w:r>
-    </w:p>
-    <w:p>
-      <w:pPr>
-        <w:rPr>
-          <w:sz w:val="32"/>
-          <w:szCs w:val="40"/>
-        </w:rPr>
-      </w:pPr>
-    </w:p>
-    <w:p>
-      <w:pPr>
-        <w:rPr>
-          <w:sz w:val="36"/>
-          <w:szCs w:val="44"/>
-        </w:rPr>
-      </w:pPr>
-    </w:p>
-    <w:p>
-      <w:pPr>
-        <w:jc w:val="center"/>
-        <w:rPr>
-          <w:b/>
-          <w:bCs/>
-          <w:sz w:val="32"/>
-          <w:szCs w:val="40"/>
-        </w:rPr>
-      </w:pPr>
-    </w:p>
-    <w:p>
-      <w:pPr>
-        <w:jc w:val="center"/>
-        <w:rPr>
-          <w:b/>
-          <w:bCs/>
-          <w:sz w:val="32"/>
-          <w:szCs w:val="40"/>
-        </w:rPr>
-      </w:pPr>
-    </w:p>
-    <w:p>
-      <w:pPr>
-        <w:jc w:val="center"/>
-        <w:rPr>
-          <w:b/>
-          <w:bCs/>
-          <w:sz w:val="32"/>
-          <w:szCs w:val="40"/>
-        </w:rPr>
-      </w:pPr>
-    </w:p>
-    <w:p>
-      <w:pPr>
-        <w:jc w:val="center"/>
-        <w:rPr>
-          <w:b/>
-          <w:bCs/>
-          <w:sz w:val="32"/>
-          <w:szCs w:val="40"/>
-        </w:rPr>
-      </w:pPr>
+      </w:r>
+      <w:r>
+        <w:rPr>
+          <w:szCs w:val="22"/>
+        </w:rPr>
+        <w:t xml:space="preserve">The purpose of the document is to explain the function of each sub-block </w:t>
+      </w:r>
+      <w:r>
+        <w:rPr>
+          <w:szCs w:val="22"/>
+        </w:rPr>
+        <w:t xml:space="preserve">inside the ALU </w:t>
+      </w:r>
+      <w:r>
+        <w:rPr>
+          <w:szCs w:val="22"/>
+        </w:rPr>
+        <w:t>(called “L</w:t>
+      </w:r>
+      <w:r>
+        <w:rPr>
+          <w:szCs w:val="22"/>
+        </w:rPr>
+        <w:t>3</w:t>
+      </w:r>
+      <w:r>
+        <w:rPr>
+          <w:szCs w:val="22"/>
+        </w:rPr>
+        <w:t>”) to understand how it’ll work.</w:t>
+      </w:r>
+    </w:p>
+    <w:p>
+      <w:pPr>
+        <w:keepNext/>
+        <w:jc w:val="center"/>
+      </w:pPr>
+      <w:r>
+        <w:rPr>
+          <w:noProof/>
+        </w:rPr>
+        <w:drawing>
+          <wp:inline distT="0" distB="0" distL="0" distR="0">
+            <wp:extent cx="3280410" cy="5617869"/>
+            <wp:effectExtent l="19050" t="0" r="0" b="0"/>
+            <wp:docPr id="3" name="Picture 1"/>
+            <wp:cNvGraphicFramePr>
+              <a:graphicFrameLocks xmlns:a="http://schemas.openxmlformats.org/drawingml/2006/main" noChangeAspect="1"/>
+            </wp:cNvGraphicFramePr>
+            <a:graphic xmlns:a="http://schemas.openxmlformats.org/drawingml/2006/main">
+              <a:graphicData uri="http://schemas.openxmlformats.org/drawingml/2006/picture">
+                <pic:pic xmlns:pic="http://schemas.openxmlformats.org/drawingml/2006/picture">
+                  <pic:nvPicPr>
+                    <pic:cNvPr id="0" name="Picture 1"/>
+                    <pic:cNvPicPr>
+                      <a:picLocks noChangeAspect="1" noChangeArrowheads="1"/>
+                    </pic:cNvPicPr>
+                  </pic:nvPicPr>
+                  <pic:blipFill>
+                    <a:blip r:embed="rId6" cstate="print"/>
+                    <a:srcRect/>
+                    <a:stretch>
+                      <a:fillRect/>
+                    </a:stretch>
+                  </pic:blipFill>
+                  <pic:spPr bwMode="auto">
+                    <a:xfrm>
+                      <a:off x="0" y="0"/>
+                      <a:ext cx="3281126" cy="5619095"/>
+                    </a:xfrm>
+                    <a:prstGeom prst="rect">
+                      <a:avLst/>
+                    </a:prstGeom>
+                    <a:noFill/>
+                    <a:ln w="9525">
+                      <a:noFill/>
+                      <a:miter lim="800000"/>
+                      <a:headEnd/>
+                      <a:tailEnd/>
+                    </a:ln>
+                  </pic:spPr>
+                </pic:pic>
+              </a:graphicData>
+            </a:graphic>
+          </wp:inline>
+        </w:drawing>
+      </w:r>
+    </w:p>
+    <w:p>
+      <w:pPr>
+        <w:pStyle w:val="Caption"/>
+        <w:jc w:val="center"/>
+      </w:pPr>
+      <w:r>
+        <w:t xml:space="preserve">Figure </w:t>
+      </w:r>
+      <w:fldSimple w:instr=" SEQ Figure \* ARABIC ">
+        <w:r>
+          <w:rPr>
+            <w:noProof/>
+          </w:rPr>
+          <w:t>1</w:t>
+        </w:r>
+      </w:fldSimple>
+      <w:r>
+        <w:t xml:space="preserve"> : the diagram of the ALU's flag block</w:t>
+      </w:r>
+    </w:p>
+    <w:p/>
+    <w:p/>
+    <w:p/>
+    <w:p/>
+    <w:p/>
+    <w:p>
+      <w:pPr>
+        <w:rPr>
+          <w:szCs w:val="22"/>
+        </w:rPr>
+      </w:pPr>
+      <w:r>
+        <w:rPr>
+          <w:sz w:val="32"/>
+          <w:szCs w:val="40"/>
+        </w:rPr>
+        <w:lastRenderedPageBreak/>
+        <w:tab/>
+      </w:r>
+      <w:r>
+        <w:rPr>
+          <w:szCs w:val="22"/>
+        </w:rPr>
+        <w:t>From figure 1, one will see that the flag block will have a following L3 blocks:</w:t>
+      </w:r>
+    </w:p>
+    <w:p>
+      <w:pPr>
+        <w:rPr>
+          <w:szCs w:val="22"/>
+        </w:rPr>
+      </w:pPr>
+      <w:r>
+        <w:rPr>
+          <w:szCs w:val="22"/>
+        </w:rPr>
+        <w:tab/>
+      </w:r>
+      <w:r>
+        <w:rPr>
+          <w:szCs w:val="22"/>
+        </w:rPr>
+        <w:tab/>
+        <w:t>-Signed computation block (S. COMP)</w:t>
+      </w:r>
+    </w:p>
+    <w:p>
+      <w:pPr>
+        <w:rPr>
+          <w:szCs w:val="22"/>
+        </w:rPr>
+      </w:pPr>
+      <w:r>
+        <w:rPr>
+          <w:szCs w:val="22"/>
+        </w:rPr>
+        <w:tab/>
+      </w:r>
+      <w:r>
+        <w:rPr>
+          <w:szCs w:val="22"/>
+        </w:rPr>
+        <w:tab/>
+        <w:t>-</w:t>
+      </w:r>
+      <w:r>
+        <w:rPr>
+          <w:szCs w:val="22"/>
+        </w:rPr>
+        <w:t>Negative computation block (N. COMP)</w:t>
+      </w:r>
+    </w:p>
+    <w:p>
+      <w:pPr>
+        <w:rPr>
+          <w:szCs w:val="22"/>
+        </w:rPr>
+      </w:pPr>
+      <w:r>
+        <w:rPr>
+          <w:szCs w:val="22"/>
+        </w:rPr>
+        <w:tab/>
+      </w:r>
+      <w:r>
+        <w:rPr>
+          <w:szCs w:val="22"/>
+        </w:rPr>
+        <w:tab/>
+        <w:t>-Overflow computation block (V. COMP)</w:t>
+      </w:r>
+    </w:p>
+    <w:p>
+      <w:pPr>
+        <w:rPr>
+          <w:szCs w:val="22"/>
+        </w:rPr>
+      </w:pPr>
+      <w:r>
+        <w:rPr>
+          <w:szCs w:val="22"/>
+        </w:rPr>
+        <w:tab/>
+      </w:r>
+      <w:r>
+        <w:rPr>
+          <w:szCs w:val="22"/>
+        </w:rPr>
+        <w:tab/>
+        <w:t>-Zero computation block (Z. COMP)</w:t>
+      </w:r>
+    </w:p>
+    <w:p>
+      <w:pPr>
+        <w:rPr>
+          <w:szCs w:val="22"/>
+        </w:rPr>
+      </w:pPr>
+      <w:r>
+        <w:rPr>
+          <w:szCs w:val="22"/>
+        </w:rPr>
+        <w:tab/>
+      </w:r>
+      <w:r>
+        <w:rPr>
+          <w:szCs w:val="22"/>
+        </w:rPr>
+        <w:tab/>
+        <w:t>-Carry computation block (C. COMP)</w:t>
+      </w:r>
+    </w:p>
+    <w:p>
+      <w:pPr>
+        <w:keepNext/>
+        <w:jc w:val="center"/>
+      </w:pPr>
+      <w:r>
+        <w:rPr>
+          <w:noProof/>
+          <w:szCs w:val="22"/>
+        </w:rPr>
+        <w:drawing>
+          <wp:inline distT="0" distB="0" distL="0" distR="0">
+            <wp:extent cx="2990850" cy="1513694"/>
+            <wp:effectExtent l="19050" t="0" r="0" b="0"/>
+            <wp:docPr id="4" name="Picture 4"/>
+            <wp:cNvGraphicFramePr>
+              <a:graphicFrameLocks xmlns:a="http://schemas.openxmlformats.org/drawingml/2006/main" noChangeAspect="1"/>
+            </wp:cNvGraphicFramePr>
+            <a:graphic xmlns:a="http://schemas.openxmlformats.org/drawingml/2006/main">
+              <a:graphicData uri="http://schemas.openxmlformats.org/drawingml/2006/picture">
+                <pic:pic xmlns:pic="http://schemas.openxmlformats.org/drawingml/2006/picture">
+                  <pic:nvPicPr>
+                    <pic:cNvPr id="0" name="Picture 4"/>
+                    <pic:cNvPicPr>
+                      <a:picLocks noChangeAspect="1" noChangeArrowheads="1"/>
+                    </pic:cNvPicPr>
+                  </pic:nvPicPr>
+                  <pic:blipFill>
+                    <a:blip r:embed="rId7" cstate="print"/>
+                    <a:srcRect/>
+                    <a:stretch>
+                      <a:fillRect/>
+                    </a:stretch>
+                  </pic:blipFill>
+                  <pic:spPr bwMode="auto">
+                    <a:xfrm>
+                      <a:off x="0" y="0"/>
+                      <a:ext cx="2993461" cy="1515016"/>
+                    </a:xfrm>
+                    <a:prstGeom prst="rect">
+                      <a:avLst/>
+                    </a:prstGeom>
+                    <a:noFill/>
+                    <a:ln w="9525">
+                      <a:noFill/>
+                      <a:miter lim="800000"/>
+                      <a:headEnd/>
+                      <a:tailEnd/>
+                    </a:ln>
+                  </pic:spPr>
+                </pic:pic>
+              </a:graphicData>
+            </a:graphic>
+          </wp:inline>
+        </w:drawing>
+      </w:r>
+    </w:p>
+    <w:p>
+      <w:pPr>
+        <w:pStyle w:val="Caption"/>
+        <w:jc w:val="center"/>
+        <w:rPr>
+          <w:sz w:val="22"/>
+        </w:rPr>
+      </w:pPr>
+      <w:r>
+        <w:t xml:space="preserve">Figure </w:t>
+      </w:r>
+      <w:fldSimple w:instr=" SEQ Figure \* ARABIC ">
+        <w:r>
+          <w:rPr>
+            <w:noProof/>
+          </w:rPr>
+          <w:t>2</w:t>
+        </w:r>
+      </w:fldSimple>
+      <w:r>
+        <w:t xml:space="preserve"> : flags f</w:t>
+      </w:r>
+      <w:r>
+        <w:t xml:space="preserve">or Ra, </w:t>
+      </w:r>
+      <w:r>
+        <w:t>Rb</w:t>
+      </w:r>
+    </w:p>
+    <w:p>
+      <w:pPr>
+        <w:keepNext/>
+        <w:jc w:val="center"/>
+      </w:pPr>
+      <w:r>
+        <w:rPr>
+          <w:b/>
+          <w:bCs/>
+          <w:noProof/>
+          <w:sz w:val="32"/>
+          <w:szCs w:val="40"/>
+        </w:rPr>
+        <w:drawing>
+          <wp:inline distT="0" distB="0" distL="0" distR="0">
+            <wp:extent cx="2552400" cy="1590424"/>
+            <wp:effectExtent l="19050" t="0" r="300" b="0"/>
+            <wp:docPr id="19" name="Picture 19"/>
+            <wp:cNvGraphicFramePr>
+              <a:graphicFrameLocks xmlns:a="http://schemas.openxmlformats.org/drawingml/2006/main" noChangeAspect="1"/>
+            </wp:cNvGraphicFramePr>
+            <a:graphic xmlns:a="http://schemas.openxmlformats.org/drawingml/2006/main">
+              <a:graphicData uri="http://schemas.openxmlformats.org/drawingml/2006/picture">
+                <pic:pic xmlns:pic="http://schemas.openxmlformats.org/drawingml/2006/picture">
+                  <pic:nvPicPr>
+                    <pic:cNvPr id="0" name="Picture 19"/>
+                    <pic:cNvPicPr>
+                      <a:picLocks noChangeAspect="1" noChangeArrowheads="1"/>
+                    </pic:cNvPicPr>
+                  </pic:nvPicPr>
+                  <pic:blipFill>
+                    <a:blip r:embed="rId8" cstate="print"/>
+                    <a:srcRect/>
+                    <a:stretch>
+                      <a:fillRect/>
+                    </a:stretch>
+                  </pic:blipFill>
+                  <pic:spPr bwMode="auto">
+                    <a:xfrm>
+                      <a:off x="0" y="0"/>
+                      <a:ext cx="2552400" cy="1590424"/>
+                    </a:xfrm>
+                    <a:prstGeom prst="rect">
+                      <a:avLst/>
+                    </a:prstGeom>
+                    <a:noFill/>
+                    <a:ln w="9525">
+                      <a:noFill/>
+                      <a:miter lim="800000"/>
+                      <a:headEnd/>
+                      <a:tailEnd/>
+                    </a:ln>
+                  </pic:spPr>
+                </pic:pic>
+              </a:graphicData>
+            </a:graphic>
+          </wp:inline>
+        </w:drawing>
+      </w:r>
+    </w:p>
+    <w:p>
+      <w:pPr>
+        <w:pStyle w:val="Caption"/>
+        <w:jc w:val="center"/>
+      </w:pPr>
+      <w:r>
+        <w:t xml:space="preserve">Figure </w:t>
+      </w:r>
+      <w:fldSimple w:instr=" SEQ Figure \* ARABIC ">
+        <w:r>
+          <w:rPr>
+            <w:noProof/>
+          </w:rPr>
+          <w:t>3</w:t>
+        </w:r>
+      </w:fldSimple>
+      <w:r>
+        <w:t xml:space="preserve"> : Flags for NOT Ra</w:t>
+      </w:r>
+    </w:p>
+    <w:p>
+      <w:pPr>
+        <w:keepNext/>
+        <w:jc w:val="center"/>
+      </w:pPr>
+      <w:r>
+        <w:rPr>
+          <w:noProof/>
+        </w:rPr>
+        <w:drawing>
+          <wp:inline distT="0" distB="0" distL="0" distR="0">
+            <wp:extent cx="3059430" cy="1424480"/>
+            <wp:effectExtent l="19050" t="0" r="7620" b="0"/>
+            <wp:docPr id="2" name="Picture 22"/>
+            <wp:cNvGraphicFramePr>
+              <a:graphicFrameLocks xmlns:a="http://schemas.openxmlformats.org/drawingml/2006/main" noChangeAspect="1"/>
+            </wp:cNvGraphicFramePr>
+            <a:graphic xmlns:a="http://schemas.openxmlformats.org/drawingml/2006/main">
+              <a:graphicData uri="http://schemas.openxmlformats.org/drawingml/2006/picture">
+                <pic:pic xmlns:pic="http://schemas.openxmlformats.org/drawingml/2006/picture">
+                  <pic:nvPicPr>
+                    <pic:cNvPr id="0" name="Picture 22"/>
+                    <pic:cNvPicPr>
+                      <a:picLocks noChangeAspect="1" noChangeArrowheads="1"/>
+                    </pic:cNvPicPr>
+                  </pic:nvPicPr>
+                  <pic:blipFill>
+                    <a:blip r:embed="rId9" cstate="print"/>
+                    <a:srcRect/>
+                    <a:stretch>
+                      <a:fillRect/>
+                    </a:stretch>
+                  </pic:blipFill>
+                  <pic:spPr bwMode="auto">
+                    <a:xfrm>
+                      <a:off x="0" y="0"/>
+                      <a:ext cx="3058957" cy="1424260"/>
+                    </a:xfrm>
+                    <a:prstGeom prst="rect">
+                      <a:avLst/>
+                    </a:prstGeom>
+                    <a:noFill/>
+                    <a:ln w="9525">
+                      <a:noFill/>
+                      <a:miter lim="800000"/>
+                      <a:headEnd/>
+                      <a:tailEnd/>
+                    </a:ln>
+                  </pic:spPr>
+                </pic:pic>
+              </a:graphicData>
+            </a:graphic>
+          </wp:inline>
+        </w:drawing>
+      </w:r>
+    </w:p>
+    <w:p>
+      <w:pPr>
+        <w:pStyle w:val="Caption"/>
+        <w:jc w:val="center"/>
+      </w:pPr>
+      <w:r>
+        <w:t xml:space="preserve">Figure </w:t>
+      </w:r>
+      <w:fldSimple w:instr=" SEQ Figure \* ARABIC ">
+        <w:r>
+          <w:rPr>
+            <w:noProof/>
+          </w:rPr>
+          <w:t>4</w:t>
+        </w:r>
+      </w:fldSimple>
+      <w:r>
+        <w:t xml:space="preserve"> : Flags for ADD Ra, Rb</w:t>
+      </w:r>
+    </w:p>
+    <w:p/>
+    <w:p/>
+    <w:p>
+      <w:pPr>
+        <w:keepNext/>
+        <w:jc w:val="center"/>
+      </w:pPr>
+      <w:r>
+        <w:rPr>
+          <w:noProof/>
+        </w:rPr>
+        <w:lastRenderedPageBreak/>
+        <w:drawing>
+          <wp:inline distT="0" distB="0" distL="0" distR="0">
+            <wp:extent cx="3948148" cy="1424940"/>
+            <wp:effectExtent l="19050" t="0" r="0" b="0"/>
+            <wp:docPr id="37" name="Picture 37"/>
+            <wp:cNvGraphicFramePr>
+              <a:graphicFrameLocks xmlns:a="http://schemas.openxmlformats.org/drawingml/2006/main" noChangeAspect="1"/>
+            </wp:cNvGraphicFramePr>
+            <a:graphic xmlns:a="http://schemas.openxmlformats.org/drawingml/2006/main">
+              <a:graphicData uri="http://schemas.openxmlformats.org/drawingml/2006/picture">
+                <pic:pic xmlns:pic="http://schemas.openxmlformats.org/drawingml/2006/picture">
+                  <pic:nvPicPr>
+                    <pic:cNvPr id="0" name="Picture 37"/>
+                    <pic:cNvPicPr>
+                      <a:picLocks noChangeAspect="1" noChangeArrowheads="1"/>
+                    </pic:cNvPicPr>
+                  </pic:nvPicPr>
+                  <pic:blipFill>
+                    <a:blip r:embed="rId10" cstate="print"/>
+                    <a:srcRect/>
+                    <a:stretch>
+                      <a:fillRect/>
+                    </a:stretch>
+                  </pic:blipFill>
+                  <pic:spPr bwMode="auto">
+                    <a:xfrm>
+                      <a:off x="0" y="0"/>
+                      <a:ext cx="3961030" cy="1429589"/>
+                    </a:xfrm>
+                    <a:prstGeom prst="rect">
+                      <a:avLst/>
+                    </a:prstGeom>
+                    <a:noFill/>
+                    <a:ln w="9525">
+                      <a:noFill/>
+                      <a:miter lim="800000"/>
+                      <a:headEnd/>
+                      <a:tailEnd/>
+                    </a:ln>
+                  </pic:spPr>
+                </pic:pic>
+              </a:graphicData>
+            </a:graphic>
+          </wp:inline>
+        </w:drawing>
+      </w:r>
+    </w:p>
+    <w:p>
+      <w:pPr>
+        <w:pStyle w:val="Caption"/>
+        <w:jc w:val="center"/>
+      </w:pPr>
+      <w:r>
+        <w:t xml:space="preserve">Figure </w:t>
+      </w:r>
+      <w:fldSimple w:instr=" SEQ Figure \* ARABIC ">
+        <w:r>
+          <w:rPr>
+            <w:noProof/>
+          </w:rPr>
+          <w:t>5</w:t>
+        </w:r>
+      </w:fldSimple>
+      <w:r>
+        <w:t xml:space="preserve"> : the flag for SUB Ra, Rb</w:t>
+      </w:r>
+    </w:p>
+    <w:p>
+      <w:pPr>
+        <w:tabs>
+          <w:tab w:val="left" w:pos="6768"/>
+        </w:tabs>
+        <w:rPr>
+          <w:sz w:val="28"/>
+          <w:szCs w:val="36"/>
+        </w:rPr>
+      </w:pPr>
+      <w:r>
+        <w:rPr>
+          <w:sz w:val="28"/>
+          <w:szCs w:val="36"/>
+        </w:rPr>
+        <w:t>Signed computation block</w:t>
+      </w:r>
+    </w:p>
+    <w:p>
+      <w:pPr>
+        <w:tabs>
+          <w:tab w:val="left" w:pos="6768"/>
+        </w:tabs>
+      </w:pPr>
+      <w:r>
+        <w:t xml:space="preserve"> Signed computation block is the block that compiles the sign flag, with computing conditions not changed from the ALU mode.</w:t>
+      </w:r>
+    </w:p>
+    <w:p>
+      <w:pPr>
+        <w:tabs>
+          <w:tab w:val="left" w:pos="6768"/>
+        </w:tabs>
+        <w:rPr>
+          <w:sz w:val="28"/>
+          <w:szCs w:val="36"/>
+        </w:rPr>
+      </w:pPr>
+    </w:p>
+    <w:p>
+      <w:pPr>
+        <w:tabs>
+          <w:tab w:val="left" w:pos="6768"/>
+        </w:tabs>
+        <w:rPr>
+          <w:sz w:val="28"/>
+          <w:szCs w:val="36"/>
+        </w:rPr>
+      </w:pPr>
+      <w:r>
+        <w:rPr>
+          <w:sz w:val="28"/>
+          <w:szCs w:val="36"/>
+        </w:rPr>
+        <w:t>Negative computation block</w:t>
+      </w:r>
+    </w:p>
+    <w:p>
+      <w:pPr>
+        <w:tabs>
+          <w:tab w:val="left" w:pos="6768"/>
+        </w:tabs>
+      </w:pPr>
+      <w:r>
+        <w:t>Negative computation block is the block that compiles the negative flag, with computing conditions not changed from the ALU mode.</w:t>
+      </w:r>
+    </w:p>
+    <w:p>
+      <w:pPr>
+        <w:tabs>
+          <w:tab w:val="left" w:pos="6768"/>
+        </w:tabs>
+        <w:rPr>
+          <w:sz w:val="28"/>
+          <w:szCs w:val="36"/>
+        </w:rPr>
+      </w:pPr>
+    </w:p>
+    <w:p>
+      <w:pPr>
+        <w:tabs>
+          <w:tab w:val="left" w:pos="6768"/>
+        </w:tabs>
+        <w:rPr>
+          <w:sz w:val="28"/>
+          <w:szCs w:val="36"/>
+        </w:rPr>
+      </w:pPr>
+      <w:r>
+        <w:rPr>
+          <w:sz w:val="28"/>
+          <w:szCs w:val="36"/>
+        </w:rPr>
+        <w:t>Overflow computation block</w:t>
+      </w:r>
+    </w:p>
+    <w:p>
+      <w:pPr>
+        <w:tabs>
+          <w:tab w:val="left" w:pos="6768"/>
+        </w:tabs>
+      </w:pPr>
+      <w:r>
+        <w:t>Overflow computation block is the block that compiles the overflow flag, with computing conditions not changed from the ALU mode.</w:t>
+      </w:r>
+    </w:p>
+    <w:p>
+      <w:pPr>
+        <w:tabs>
+          <w:tab w:val="left" w:pos="6768"/>
+        </w:tabs>
+        <w:rPr>
+          <w:sz w:val="28"/>
+          <w:szCs w:val="36"/>
+        </w:rPr>
+      </w:pPr>
+    </w:p>
+    <w:p>
+      <w:pPr>
+        <w:tabs>
+          <w:tab w:val="left" w:pos="6768"/>
+        </w:tabs>
+        <w:rPr>
+          <w:sz w:val="28"/>
+          <w:szCs w:val="36"/>
+        </w:rPr>
+      </w:pPr>
+      <w:r>
+        <w:rPr>
+          <w:sz w:val="28"/>
+          <w:szCs w:val="36"/>
+        </w:rPr>
+        <w:t>Zero computation block</w:t>
+      </w:r>
+    </w:p>
+    <w:p>
+      <w:pPr>
+        <w:tabs>
+          <w:tab w:val="left" w:pos="6768"/>
+        </w:tabs>
+      </w:pPr>
+      <w:r>
+        <w:t>Zero computation block is the block that compiles the zero flag, with computing conditions not changed from the ALU mode.</w:t>
+      </w:r>
+    </w:p>
+    <w:p>
+      <w:pPr>
+        <w:tabs>
+          <w:tab w:val="left" w:pos="6768"/>
+        </w:tabs>
+        <w:rPr>
+          <w:sz w:val="28"/>
+          <w:szCs w:val="36"/>
+        </w:rPr>
+      </w:pPr>
+    </w:p>
+    <w:p>
+      <w:pPr>
+        <w:tabs>
+          <w:tab w:val="left" w:pos="6768"/>
+        </w:tabs>
+        <w:rPr>
+          <w:sz w:val="28"/>
+          <w:szCs w:val="36"/>
+        </w:rPr>
+      </w:pPr>
+      <w:r>
+        <w:rPr>
+          <w:sz w:val="28"/>
+          <w:szCs w:val="36"/>
+        </w:rPr>
+        <w:t>Carry computation block</w:t>
+      </w:r>
+    </w:p>
+    <w:p>
+      <w:pPr>
+        <w:tabs>
+          <w:tab w:val="left" w:pos="6768"/>
+        </w:tabs>
+      </w:pPr>
+      <w:r>
+        <w:t xml:space="preserve">Carry computation block is the block that compiles the carry flag, with computing conditions </w:t>
+      </w:r>
+      <w:r>
+        <w:rPr>
+          <w:b/>
+          <w:bCs/>
+        </w:rPr>
+        <w:t>changed</w:t>
+      </w:r>
+      <w:r>
+        <w:t xml:space="preserve"> from the ALU mode.</w:t>
+      </w:r>
+    </w:p>
+    <w:p>
+      <w:pPr>
+        <w:tabs>
+          <w:tab w:val="left" w:pos="6768"/>
+        </w:tabs>
+        <w:rPr>
+          <w:sz w:val="28"/>
+          <w:szCs w:val="36"/>
+        </w:rPr>
+      </w:pPr>
+    </w:p>
+    <w:p>
+      <w:pPr>
+        <w:keepNext/>
+        <w:tabs>
+          <w:tab w:val="left" w:pos="6768"/>
+        </w:tabs>
+        <w:jc w:val="center"/>
+      </w:pPr>
+      <w:r>
+        <w:rPr>
+          <w:noProof/>
+          <w:sz w:val="20"/>
+          <w:szCs w:val="24"/>
+        </w:rPr>
+        <w:lastRenderedPageBreak/>
+        <w:drawing>
+          <wp:inline distT="0" distB="0" distL="0" distR="0">
+            <wp:extent cx="3486150" cy="1877988"/>
+            <wp:effectExtent l="19050" t="0" r="0" b="0"/>
+            <wp:docPr id="5" name="Picture 4"/>
+            <wp:cNvGraphicFramePr>
+              <a:graphicFrameLocks xmlns:a="http://schemas.openxmlformats.org/drawingml/2006/main" noChangeAspect="1"/>
+            </wp:cNvGraphicFramePr>
+            <a:graphic xmlns:a="http://schemas.openxmlformats.org/drawingml/2006/main">
+              <a:graphicData uri="http://schemas.openxmlformats.org/drawingml/2006/picture">
+                <pic:pic xmlns:pic="http://schemas.openxmlformats.org/drawingml/2006/picture">
+                  <pic:nvPicPr>
+                    <pic:cNvPr id="0" name="Picture 4"/>
+                    <pic:cNvPicPr>
+                      <a:picLocks noChangeAspect="1" noChangeArrowheads="1"/>
+                    </pic:cNvPicPr>
+                  </pic:nvPicPr>
+                  <pic:blipFill>
+                    <a:blip r:embed="rId11" cstate="print"/>
+                    <a:srcRect/>
+                    <a:stretch>
+                      <a:fillRect/>
+                    </a:stretch>
+                  </pic:blipFill>
+                  <pic:spPr bwMode="auto">
+                    <a:xfrm>
+                      <a:off x="0" y="0"/>
+                      <a:ext cx="3488850" cy="1879443"/>
+                    </a:xfrm>
+                    <a:prstGeom prst="rect">
+                      <a:avLst/>
+                    </a:prstGeom>
+                    <a:noFill/>
+                    <a:ln w="9525">
+                      <a:noFill/>
+                      <a:miter lim="800000"/>
+                      <a:headEnd/>
+                      <a:tailEnd/>
+                    </a:ln>
+                  </pic:spPr>
+                </pic:pic>
+              </a:graphicData>
+            </a:graphic>
+          </wp:inline>
+        </w:drawing>
+      </w:r>
+    </w:p>
+    <w:p>
+      <w:pPr>
+        <w:pStyle w:val="Caption"/>
+        <w:jc w:val="center"/>
+        <w:rPr>
+          <w:sz w:val="20"/>
+          <w:szCs w:val="24"/>
+        </w:rPr>
+      </w:pPr>
+      <w:r>
+        <w:t xml:space="preserve">Figure </w:t>
+      </w:r>
+      <w:fldSimple w:instr=" SEQ Figure \* ARABIC ">
+        <w:r>
+          <w:rPr>
+            <w:noProof/>
+          </w:rPr>
+          <w:t>6</w:t>
+        </w:r>
+      </w:fldSimple>
+      <w:r>
+        <w:t xml:space="preserve"> : the table for logic for the flag from CpuDesign.docx</w:t>
+      </w:r>
     </w:p>
     <w:sectPr>
       <w:pgSz w:w="12240" w:h="15840"/>
@@ -156,6 +1313,104 @@
     </w:sectPr>
   </w:body>
 </w:document>
+</file>
+
+<file path=word/numbering.xml><?xml version="1.0" encoding="utf-8"?>
+<w:numbering xmlns:ve="http://schemas.openxmlformats.org/markup-compatibility/2006" xmlns:o="urn:schemas-microsoft-com:office:office" xmlns:r="http://schemas.openxmlformats.org/officeDocument/2006/relationships" xmlns:m="http://schemas.openxmlformats.org/officeDocument/2006/math" xmlns:v="urn:schemas-microsoft-com:vml" xmlns:wp="http://schemas.openxmlformats.org/drawingml/2006/wordprocessingDrawing" xmlns:w10="urn:schemas-microsoft-com:office:word" xmlns:w="http://schemas.openxmlformats.org/wordprocessingml/2006/main" xmlns:wne="http://schemas.microsoft.com/office/word/2006/wordml">
+  <w:abstractNum w:abstractNumId="0">
+    <w:nsid w:val="49644484"/>
+    <w:multiLevelType w:val="hybridMultilevel"/>
+    <w:tmpl w:val="CEC8894C"/>
+    <w:lvl w:ilvl="0" w:tplc="5B2C1C02">
+      <w:start w:val="1"/>
+      <w:numFmt w:val="decimal"/>
+      <w:lvlText w:val="%1."/>
+      <w:lvlJc w:val="left"/>
+      <w:pPr>
+        <w:ind w:left="720" w:hanging="360"/>
+      </w:pPr>
+      <w:rPr>
+        <w:rFonts w:hint="default"/>
+        <w:sz w:val="22"/>
+      </w:rPr>
+    </w:lvl>
+    <w:lvl w:ilvl="1" w:tplc="04090019" w:tentative="1">
+      <w:start w:val="1"/>
+      <w:numFmt w:val="lowerLetter"/>
+      <w:lvlText w:val="%2."/>
+      <w:lvlJc w:val="left"/>
+      <w:pPr>
+        <w:ind w:left="1440" w:hanging="360"/>
+      </w:pPr>
+    </w:lvl>
+    <w:lvl w:ilvl="2" w:tplc="0409001B" w:tentative="1">
+      <w:start w:val="1"/>
+      <w:numFmt w:val="lowerRoman"/>
+      <w:lvlText w:val="%3."/>
+      <w:lvlJc w:val="right"/>
+      <w:pPr>
+        <w:ind w:left="2160" w:hanging="180"/>
+      </w:pPr>
+    </w:lvl>
+    <w:lvl w:ilvl="3" w:tplc="0409000F" w:tentative="1">
+      <w:start w:val="1"/>
+      <w:numFmt w:val="decimal"/>
+      <w:lvlText w:val="%4."/>
+      <w:lvlJc w:val="left"/>
+      <w:pPr>
+        <w:ind w:left="2880" w:hanging="360"/>
+      </w:pPr>
+    </w:lvl>
+    <w:lvl w:ilvl="4" w:tplc="04090019" w:tentative="1">
+      <w:start w:val="1"/>
+      <w:numFmt w:val="lowerLetter"/>
+      <w:lvlText w:val="%5."/>
+      <w:lvlJc w:val="left"/>
+      <w:pPr>
+        <w:ind w:left="3600" w:hanging="360"/>
+      </w:pPr>
+    </w:lvl>
+    <w:lvl w:ilvl="5" w:tplc="0409001B" w:tentative="1">
+      <w:start w:val="1"/>
+      <w:numFmt w:val="lowerRoman"/>
+      <w:lvlText w:val="%6."/>
+      <w:lvlJc w:val="right"/>
+      <w:pPr>
+        <w:ind w:left="4320" w:hanging="180"/>
+      </w:pPr>
+    </w:lvl>
+    <w:lvl w:ilvl="6" w:tplc="0409000F" w:tentative="1">
+      <w:start w:val="1"/>
+      <w:numFmt w:val="decimal"/>
+      <w:lvlText w:val="%7."/>
+      <w:lvlJc w:val="left"/>
+      <w:pPr>
+        <w:ind w:left="5040" w:hanging="360"/>
+      </w:pPr>
+    </w:lvl>
+    <w:lvl w:ilvl="7" w:tplc="04090019" w:tentative="1">
+      <w:start w:val="1"/>
+      <w:numFmt w:val="lowerLetter"/>
+      <w:lvlText w:val="%8."/>
+      <w:lvlJc w:val="left"/>
+      <w:pPr>
+        <w:ind w:left="5760" w:hanging="360"/>
+      </w:pPr>
+    </w:lvl>
+    <w:lvl w:ilvl="8" w:tplc="0409001B" w:tentative="1">
+      <w:start w:val="1"/>
+      <w:numFmt w:val="lowerRoman"/>
+      <w:lvlText w:val="%9."/>
+      <w:lvlJc w:val="right"/>
+      <w:pPr>
+        <w:ind w:left="6480" w:hanging="180"/>
+      </w:pPr>
+    </w:lvl>
+  </w:abstractNum>
+  <w:num w:numId="1">
+    <w:abstractNumId w:val="0"/>
+  </w:num>
+</w:numbering>
 </file>
 
 <file path=word/styles.xml><?xml version="1.0" encoding="utf-8"?>
@@ -346,6 +1601,92 @@
     <w:uiPriority w:val="99"/>
     <w:semiHidden/>
     <w:unhideWhenUsed/>
+  </w:style>
+  <w:style w:type="paragraph" w:styleId="BalloonText">
+    <w:name w:val="Balloon Text"/>
+    <w:basedOn w:val="Normal"/>
+    <w:link w:val="BalloonTextChar"/>
+    <w:uiPriority w:val="99"/>
+    <w:semiHidden/>
+    <w:unhideWhenUsed/>
+    <w:rsid w:val="0091566F"/>
+    <w:pPr>
+      <w:spacing w:after="0" w:line="240" w:lineRule="auto"/>
+    </w:pPr>
+    <w:rPr>
+      <w:rFonts w:ascii="Tahoma" w:hAnsi="Tahoma" w:cs="Angsana New"/>
+      <w:sz w:val="16"/>
+      <w:szCs w:val="20"/>
+    </w:rPr>
+  </w:style>
+  <w:style w:type="character" w:customStyle="1" w:styleId="BalloonTextChar">
+    <w:name w:val="Balloon Text Char"/>
+    <w:basedOn w:val="DefaultParagraphFont"/>
+    <w:link w:val="BalloonText"/>
+    <w:uiPriority w:val="99"/>
+    <w:semiHidden/>
+    <w:rsid w:val="0091566F"/>
+    <w:rPr>
+      <w:rFonts w:ascii="Tahoma" w:hAnsi="Tahoma" w:cs="Angsana New"/>
+      <w:sz w:val="16"/>
+      <w:szCs w:val="20"/>
+    </w:rPr>
+  </w:style>
+  <w:style w:type="paragraph" w:styleId="Caption">
+    <w:name w:val="caption"/>
+    <w:basedOn w:val="Normal"/>
+    <w:next w:val="Normal"/>
+    <w:uiPriority w:val="35"/>
+    <w:unhideWhenUsed/>
+    <w:qFormat/>
+    <w:rsid w:val="0091566F"/>
+    <w:pPr>
+      <w:spacing w:after="200" w:line="240" w:lineRule="auto"/>
+    </w:pPr>
+    <w:rPr>
+      <w:b/>
+      <w:bCs/>
+      <w:color w:val="4472C4" w:themeColor="accent1"/>
+      <w:sz w:val="18"/>
+      <w:szCs w:val="22"/>
+    </w:rPr>
+  </w:style>
+  <w:style w:type="paragraph" w:styleId="ListParagraph">
+    <w:name w:val="List Paragraph"/>
+    <w:basedOn w:val="Normal"/>
+    <w:uiPriority w:val="34"/>
+    <w:qFormat/>
+    <w:rsid w:val="00CB3B2F"/>
+    <w:pPr>
+      <w:ind w:left="720"/>
+      <w:contextualSpacing/>
+    </w:pPr>
+  </w:style>
+  <w:style w:type="table" w:styleId="TableGrid">
+    <w:name w:val="Table Grid"/>
+    <w:basedOn w:val="TableNormal"/>
+    <w:uiPriority w:val="39"/>
+    <w:rsid w:val="00CB3B2F"/>
+    <w:pPr>
+      <w:spacing w:after="0" w:line="240" w:lineRule="auto"/>
+    </w:pPr>
+    <w:tblPr>
+      <w:tblInd w:w="0" w:type="dxa"/>
+      <w:tblBorders>
+        <w:top w:val="single" w:sz="4" w:space="0" w:color="auto"/>
+        <w:left w:val="single" w:sz="4" w:space="0" w:color="auto"/>
+        <w:bottom w:val="single" w:sz="4" w:space="0" w:color="auto"/>
+        <w:right w:val="single" w:sz="4" w:space="0" w:color="auto"/>
+        <w:insideH w:val="single" w:sz="4" w:space="0" w:color="auto"/>
+        <w:insideV w:val="single" w:sz="4" w:space="0" w:color="auto"/>
+      </w:tblBorders>
+      <w:tblCellMar>
+        <w:top w:w="0" w:type="dxa"/>
+        <w:left w:w="108" w:type="dxa"/>
+        <w:bottom w:w="0" w:type="dxa"/>
+        <w:right w:w="108" w:type="dxa"/>
+      </w:tblCellMar>
+    </w:tblPr>
   </w:style>
 </w:styles>
 </file>
@@ -643,4 +1984,16 @@
     </a:ext>
   </a:extLst>
 </a:theme>
+</file>
+
+<file path=customXml/item1.xml><?xml version="1.0" encoding="utf-8"?>
+<b:Sources xmlns:b="http://schemas.openxmlformats.org/officeDocument/2006/bibliography" xmlns="http://schemas.openxmlformats.org/officeDocument/2006/bibliography" SelectedStyle="\APA.XSL" StyleName="APA Fifth Edition"/>
+</file>
+
+<file path=customXml/itemProps1.xml><?xml version="1.0" encoding="utf-8"?>
+<ds:datastoreItem xmlns:ds="http://schemas.openxmlformats.org/officeDocument/2006/customXml" ds:itemID="{73F22DCE-6066-4ADA-BC26-32EC53725CF9}">
+  <ds:schemaRefs>
+    <ds:schemaRef ds:uri="http://schemas.openxmlformats.org/officeDocument/2006/bibliography"/>
+  </ds:schemaRefs>
+</ds:datastoreItem>
 </file>
</xml_diff>